<commit_message>
Pushing updated Module 1 Assignment
</commit_message>
<xml_diff>
--- a/csd/csd-325/module-1/Bronson_1_2.docx
+++ b/csd/csd-325/module-1/Bronson_1_2.docx
@@ -18,12 +18,60 @@
       </w:r>
     </w:p>
     <w:p>
+      <w:hyperlink r:id="rId4" w:history="1">
+        <w:r>
+          <w:rPr>
+            <w:rStyle w:val="Hyperlink"/>
+          </w:rPr>
+          <w:t>https://github.com/Wendybronson/csd-325.git</w:t>
+        </w:r>
+      </w:hyperlink>
+    </w:p>
+    <w:p/>
+    <w:p>
       <w:r>
-        <w:t>https://github.com/Wendybronson/csd-325.git</w:t>
+        <w:drawing>
+          <wp:inline distT="0" distB="0" distL="0" distR="0" wp14:anchorId="3FA34C4B" wp14:editId="0A162B4C">
+            <wp:extent cx="5943600" cy="1432069"/>
+            <wp:effectExtent l="0" t="0" r="0" b="0"/>
+            <wp:docPr id="363421938" name="Picture 1"/>
+            <wp:cNvGraphicFramePr>
+              <a:graphicFrameLocks xmlns:a="http://schemas.openxmlformats.org/drawingml/2006/main" noChangeAspect="1"/>
+            </wp:cNvGraphicFramePr>
+            <a:graphic xmlns:a="http://schemas.openxmlformats.org/drawingml/2006/main">
+              <a:graphicData uri="http://schemas.openxmlformats.org/drawingml/2006/picture">
+                <pic:pic xmlns:pic="http://schemas.openxmlformats.org/drawingml/2006/picture">
+                  <pic:nvPicPr>
+                    <pic:cNvPr id="363421938" name=""/>
+                    <pic:cNvPicPr/>
+                  </pic:nvPicPr>
+                  <pic:blipFill>
+                    <a:blip r:embed="rId5"/>
+                    <a:stretch>
+                      <a:fillRect/>
+                    </a:stretch>
+                  </pic:blipFill>
+                  <pic:spPr>
+                    <a:xfrm>
+                      <a:off x="0" y="0"/>
+                      <a:ext cx="6018758" cy="1450178"/>
+                    </a:xfrm>
+                    <a:prstGeom prst="rect">
+                      <a:avLst/>
+                    </a:prstGeom>
+                  </pic:spPr>
+                </pic:pic>
+              </a:graphicData>
+            </a:graphic>
+          </wp:inline>
+        </w:drawing>
       </w:r>
     </w:p>
     <w:p>
       <w:r>
+        <w:rPr>
+          <w:noProof/>
+        </w:rPr>
         <w:drawing>
           <wp:inline distT="0" distB="0" distL="0" distR="0" wp14:anchorId="70518775" wp14:editId="4E3F5A86">
             <wp:extent cx="5943600" cy="2667000"/>
@@ -40,7 +88,7 @@
                     <pic:cNvPicPr/>
                   </pic:nvPicPr>
                   <pic:blipFill>
-                    <a:blip r:embed="rId4"/>
+                    <a:blip r:embed="rId6"/>
                     <a:stretch>
                       <a:fillRect/>
                     </a:stretch>
@@ -49,6 +97,45 @@
                     <a:xfrm>
                       <a:off x="0" y="0"/>
                       <a:ext cx="5943600" cy="2667000"/>
+                    </a:xfrm>
+                    <a:prstGeom prst="rect">
+                      <a:avLst/>
+                    </a:prstGeom>
+                  </pic:spPr>
+                </pic:pic>
+              </a:graphicData>
+            </a:graphic>
+          </wp:inline>
+        </w:drawing>
+      </w:r>
+    </w:p>
+    <w:p>
+      <w:r>
+        <w:drawing>
+          <wp:inline distT="0" distB="0" distL="0" distR="0" wp14:anchorId="364C3AE1" wp14:editId="5051789E">
+            <wp:extent cx="5986320" cy="2832100"/>
+            <wp:effectExtent l="0" t="0" r="0" b="6350"/>
+            <wp:docPr id="697951949" name="Picture 1"/>
+            <wp:cNvGraphicFramePr>
+              <a:graphicFrameLocks xmlns:a="http://schemas.openxmlformats.org/drawingml/2006/main" noChangeAspect="1"/>
+            </wp:cNvGraphicFramePr>
+            <a:graphic xmlns:a="http://schemas.openxmlformats.org/drawingml/2006/main">
+              <a:graphicData uri="http://schemas.openxmlformats.org/drawingml/2006/picture">
+                <pic:pic xmlns:pic="http://schemas.openxmlformats.org/drawingml/2006/picture">
+                  <pic:nvPicPr>
+                    <pic:cNvPr id="697951949" name=""/>
+                    <pic:cNvPicPr/>
+                  </pic:nvPicPr>
+                  <pic:blipFill>
+                    <a:blip r:embed="rId7"/>
+                    <a:stretch>
+                      <a:fillRect/>
+                    </a:stretch>
+                  </pic:blipFill>
+                  <pic:spPr>
+                    <a:xfrm>
+                      <a:off x="0" y="0"/>
+                      <a:ext cx="6040292" cy="2857634"/>
                     </a:xfrm>
                     <a:prstGeom prst="rect">
                       <a:avLst/>

</xml_diff>